<commit_message>
update on articleAfricatek simulations
</commit_message>
<xml_diff>
--- a/2026/Evaluation expérimentale.docx
+++ b/2026/Evaluation expérimentale.docx
@@ -3756,6 +3756,871 @@
         <w:t>En comparaison au système manuel d’authentification de documents administratifs, notre solution permet de faire l’authentification en temps réel ou de manière quasi instantanée</w:t>
       </w:r>
     </w:p>
+    <w:p>
+      <w:pPr>
+        <w:spacing w:line="360" w:lineRule="auto"/>
+        <w:rPr>
+          <w:sz w:val="28"/>
+          <w:szCs w:val="28"/>
+          <w:lang w:val="fr-FR"/>
+        </w:rPr>
+      </w:pPr>
+    </w:p>
+    <w:p>
+      <w:pPr>
+        <w:spacing w:line="360" w:lineRule="auto"/>
+        <w:jc w:val="both"/>
+        <w:rPr>
+          <w:sz w:val="28"/>
+          <w:szCs w:val="28"/>
+          <w:highlight w:val="yellow"/>
+          <w:lang w:val="fr-FR"/>
+        </w:rPr>
+      </w:pPr>
+      <w:r>
+        <w:rPr>
+          <w:sz w:val="28"/>
+          <w:szCs w:val="28"/>
+          <w:highlight w:val="yellow"/>
+          <w:lang w:val="fr-FR"/>
+        </w:rPr>
+        <w:t xml:space="preserve">La solution que nous proposons </w:t>
+      </w:r>
+      <w:proofErr w:type="gramStart"/>
+      <w:r>
+        <w:rPr>
+          <w:sz w:val="28"/>
+          <w:szCs w:val="28"/>
+          <w:highlight w:val="yellow"/>
+          <w:lang w:val="fr-FR"/>
+        </w:rPr>
+        <w:t>a</w:t>
+      </w:r>
+      <w:proofErr w:type="gramEnd"/>
+      <w:r>
+        <w:rPr>
+          <w:sz w:val="28"/>
+          <w:szCs w:val="28"/>
+          <w:highlight w:val="yellow"/>
+          <w:lang w:val="fr-FR"/>
+        </w:rPr>
+        <w:t xml:space="preserve"> des implications majeures.</w:t>
+      </w:r>
+    </w:p>
+    <w:p>
+      <w:pPr>
+        <w:spacing w:line="360" w:lineRule="auto"/>
+        <w:jc w:val="both"/>
+        <w:rPr>
+          <w:sz w:val="28"/>
+          <w:szCs w:val="28"/>
+          <w:highlight w:val="yellow"/>
+          <w:lang w:val="fr-FR"/>
+        </w:rPr>
+      </w:pPr>
+      <w:r>
+        <w:rPr>
+          <w:sz w:val="28"/>
+          <w:szCs w:val="28"/>
+          <w:highlight w:val="yellow"/>
+          <w:lang w:val="fr-FR"/>
+        </w:rPr>
+        <w:t xml:space="preserve">En termes d’évolutivité, plusieurs opérations simultanées de vérification peuvent se faire sur le réseau Ethereum sans impact majeur vis à vis des utilisateurs finaux. Cependant, des opérations simultanées d’enregistrement de documents administratifs à grande échelle (des centaines voire des milliers) sur le réseau Ethereum </w:t>
+      </w:r>
+      <w:proofErr w:type="spellStart"/>
+      <w:r>
+        <w:rPr>
+          <w:sz w:val="28"/>
+          <w:szCs w:val="28"/>
+          <w:highlight w:val="yellow"/>
+          <w:lang w:val="fr-FR"/>
+        </w:rPr>
+        <w:t>Mainnet</w:t>
+      </w:r>
+      <w:proofErr w:type="spellEnd"/>
+      <w:r>
+        <w:rPr>
+          <w:sz w:val="28"/>
+          <w:szCs w:val="28"/>
+          <w:highlight w:val="yellow"/>
+          <w:lang w:val="fr-FR"/>
+        </w:rPr>
+        <w:t xml:space="preserve"> pourraient résulter d’un temps de réponse plus élevé que les 4247,66 millisecondes. En plus d’avoir un nombre élevé de transactions, on pourrait aussi avoir un volume élevé de données de transaction blockchain. Plus il y a un grand volume de données de transactions, plus il faut d’ETH pour inciter les validations rapides de ces transaction Ethereum. Notre approche reste avantageuse pour les administrations et les citoyens. Car dans le système manuel d’authentification de documents où interviennent plusieurs acteurs humains, une seule opération d’authentification dure des jours et occasionne des coûts financiers nécessairement supérieur à 10$ (sachant que la </w:t>
+      </w:r>
+      <w:r>
+        <w:rPr>
+          <w:sz w:val="28"/>
+          <w:szCs w:val="28"/>
+          <w:highlight w:val="yellow"/>
+          <w:lang w:val="fr-FR"/>
+        </w:rPr>
+        <w:lastRenderedPageBreak/>
+        <w:t>moyenne 0.0005168205083614 ETH = 1.08 $ selon https://www.xe.com/fr/currencyconverter/convert/?Amount=0.000516820508361</w:t>
+      </w:r>
+      <w:r>
+        <w:rPr>
+          <w:sz w:val="28"/>
+          <w:szCs w:val="28"/>
+          <w:highlight w:val="yellow"/>
+          <w:lang w:val="fr-FR"/>
+        </w:rPr>
+        <w:t>4</w:t>
+      </w:r>
+      <w:r>
+        <w:rPr>
+          <w:sz w:val="28"/>
+          <w:szCs w:val="28"/>
+          <w:highlight w:val="yellow"/>
+          <w:lang w:val="fr-FR"/>
+        </w:rPr>
+        <w:t>&amp;From=ETH&amp;To=USD le 25/02/2026).</w:t>
+      </w:r>
+    </w:p>
+    <w:p>
+      <w:pPr>
+        <w:spacing w:line="360" w:lineRule="auto"/>
+        <w:jc w:val="both"/>
+        <w:rPr>
+          <w:sz w:val="28"/>
+          <w:szCs w:val="28"/>
+          <w:highlight w:val="yellow"/>
+          <w:lang w:val="fr-FR"/>
+        </w:rPr>
+      </w:pPr>
+      <w:r>
+        <w:rPr>
+          <w:sz w:val="28"/>
+          <w:szCs w:val="28"/>
+          <w:highlight w:val="yellow"/>
+          <w:lang w:val="fr-FR"/>
+        </w:rPr>
+        <w:t>En termes</w:t>
+      </w:r>
+      <w:r>
+        <w:rPr>
+          <w:sz w:val="28"/>
+          <w:szCs w:val="28"/>
+          <w:highlight w:val="yellow"/>
+          <w:lang w:val="fr-FR"/>
+        </w:rPr>
+        <w:t xml:space="preserve"> d’utilisabilité, l’approche requiert peu de ressources informatiques. Les administrations tendent de plus en plus vers la modernisation des services et sont dotées matériels informatiques qui sont à mesure de supporter notre solution. Les citoyens contemporains utilisent déjà des smart phones, et pourront facilement vérifier l’authenticité de documents électroniques à travers ces périphériques.</w:t>
+      </w:r>
+    </w:p>
+    <w:p>
+      <w:pPr>
+        <w:spacing w:line="360" w:lineRule="auto"/>
+        <w:jc w:val="both"/>
+        <w:rPr>
+          <w:sz w:val="28"/>
+          <w:szCs w:val="28"/>
+          <w:highlight w:val="yellow"/>
+          <w:lang w:val="fr-FR"/>
+        </w:rPr>
+      </w:pPr>
+      <w:r>
+        <w:rPr>
+          <w:sz w:val="28"/>
+          <w:szCs w:val="28"/>
+          <w:highlight w:val="yellow"/>
+          <w:lang w:val="fr-FR"/>
+        </w:rPr>
+        <w:t>Néanmoins, des facteurs bloquants subsistent et sont considérés comme des défis. Il s’agit de</w:t>
+      </w:r>
+      <w:r>
+        <w:rPr>
+          <w:sz w:val="28"/>
+          <w:szCs w:val="28"/>
+          <w:highlight w:val="yellow"/>
+          <w:lang w:val="fr-FR"/>
+        </w:rPr>
+        <w:t xml:space="preserve"> </w:t>
+      </w:r>
+      <w:r>
+        <w:rPr>
+          <w:sz w:val="28"/>
+          <w:szCs w:val="28"/>
+          <w:highlight w:val="yellow"/>
+          <w:lang w:val="fr-FR"/>
+        </w:rPr>
+        <w:t>:</w:t>
+      </w:r>
+    </w:p>
+    <w:p>
+      <w:pPr>
+        <w:pStyle w:val="Paragraphedeliste"/>
+        <w:numPr>
+          <w:ilvl w:val="0"/>
+          <w:numId w:val="8"/>
+        </w:numPr>
+        <w:spacing w:line="360" w:lineRule="auto"/>
+        <w:jc w:val="both"/>
+        <w:rPr>
+          <w:sz w:val="28"/>
+          <w:szCs w:val="28"/>
+          <w:highlight w:val="yellow"/>
+          <w:lang w:val="fr-FR"/>
+        </w:rPr>
+      </w:pPr>
+      <w:proofErr w:type="gramStart"/>
+      <w:r>
+        <w:rPr>
+          <w:sz w:val="28"/>
+          <w:szCs w:val="28"/>
+          <w:highlight w:val="yellow"/>
+          <w:lang w:val="fr-FR"/>
+        </w:rPr>
+        <w:t>l’</w:t>
+      </w:r>
+      <w:r>
+        <w:rPr>
+          <w:sz w:val="28"/>
+          <w:szCs w:val="28"/>
+          <w:highlight w:val="yellow"/>
+          <w:lang w:val="fr-FR"/>
+        </w:rPr>
+        <w:t>interopérabilité</w:t>
+      </w:r>
+      <w:proofErr w:type="gramEnd"/>
+      <w:r>
+        <w:rPr>
+          <w:sz w:val="28"/>
+          <w:szCs w:val="28"/>
+          <w:highlight w:val="yellow"/>
+          <w:lang w:val="fr-FR"/>
+        </w:rPr>
+        <w:t xml:space="preserve"> car la communication doit être possible entre le réseau blockchain Ethereum et les infrastructures déjà existantes dans les administrations [18]. </w:t>
+      </w:r>
+    </w:p>
+    <w:p>
+      <w:pPr>
+        <w:pStyle w:val="Paragraphedeliste"/>
+        <w:numPr>
+          <w:ilvl w:val="0"/>
+          <w:numId w:val="8"/>
+        </w:numPr>
+        <w:spacing w:line="360" w:lineRule="auto"/>
+        <w:jc w:val="both"/>
+        <w:rPr>
+          <w:sz w:val="28"/>
+          <w:szCs w:val="28"/>
+          <w:highlight w:val="yellow"/>
+          <w:lang w:val="fr-FR"/>
+        </w:rPr>
+      </w:pPr>
+      <w:proofErr w:type="gramStart"/>
+      <w:r>
+        <w:rPr>
+          <w:sz w:val="28"/>
+          <w:szCs w:val="28"/>
+          <w:highlight w:val="yellow"/>
+          <w:lang w:val="fr-FR"/>
+        </w:rPr>
+        <w:t>la</w:t>
+      </w:r>
+      <w:proofErr w:type="gramEnd"/>
+      <w:r>
+        <w:rPr>
+          <w:sz w:val="28"/>
+          <w:szCs w:val="28"/>
+          <w:highlight w:val="yellow"/>
+          <w:lang w:val="fr-FR"/>
+        </w:rPr>
+        <w:t xml:space="preserve"> </w:t>
+      </w:r>
+      <w:r>
+        <w:rPr>
+          <w:sz w:val="28"/>
+          <w:szCs w:val="28"/>
+          <w:highlight w:val="yellow"/>
+          <w:lang w:val="fr-FR"/>
+        </w:rPr>
+        <w:t>révision</w:t>
+      </w:r>
+      <w:r>
+        <w:rPr>
+          <w:sz w:val="28"/>
+          <w:szCs w:val="28"/>
+          <w:highlight w:val="yellow"/>
+          <w:lang w:val="fr-FR"/>
+        </w:rPr>
+        <w:t xml:space="preserve"> des textes réglementaires qui régissent la dépense publique afin de prendre en compte les crypto monnaies ou leur parité. Cela facilitera les paiements de frais de transactions blockchain.</w:t>
+      </w:r>
+    </w:p>
+    <w:p>
+      <w:pPr>
+        <w:pStyle w:val="Paragraphedeliste"/>
+        <w:numPr>
+          <w:ilvl w:val="0"/>
+          <w:numId w:val="8"/>
+        </w:numPr>
+        <w:spacing w:line="360" w:lineRule="auto"/>
+        <w:jc w:val="both"/>
+        <w:rPr>
+          <w:sz w:val="28"/>
+          <w:szCs w:val="28"/>
+          <w:highlight w:val="yellow"/>
+          <w:lang w:val="fr-FR"/>
+        </w:rPr>
+      </w:pPr>
+      <w:proofErr w:type="gramStart"/>
+      <w:r>
+        <w:rPr>
+          <w:sz w:val="28"/>
+          <w:szCs w:val="28"/>
+          <w:highlight w:val="yellow"/>
+          <w:lang w:val="fr-FR"/>
+        </w:rPr>
+        <w:t>l</w:t>
+      </w:r>
+      <w:r>
+        <w:rPr>
+          <w:sz w:val="28"/>
+          <w:szCs w:val="28"/>
+          <w:highlight w:val="yellow"/>
+          <w:lang w:val="fr-FR"/>
+        </w:rPr>
+        <w:t>’adoption</w:t>
+      </w:r>
+      <w:proofErr w:type="gramEnd"/>
+      <w:r>
+        <w:rPr>
+          <w:sz w:val="28"/>
+          <w:szCs w:val="28"/>
+          <w:highlight w:val="yellow"/>
+          <w:lang w:val="fr-FR"/>
+        </w:rPr>
+        <w:t xml:space="preserve"> </w:t>
+      </w:r>
+      <w:r>
+        <w:rPr>
+          <w:sz w:val="28"/>
+          <w:szCs w:val="28"/>
+          <w:highlight w:val="yellow"/>
+          <w:lang w:val="fr-FR"/>
+        </w:rPr>
+        <w:t>de texte</w:t>
+      </w:r>
+      <w:r>
+        <w:rPr>
+          <w:sz w:val="28"/>
+          <w:szCs w:val="28"/>
+          <w:highlight w:val="yellow"/>
+          <w:lang w:val="fr-FR"/>
+        </w:rPr>
+        <w:t>s</w:t>
+      </w:r>
+      <w:r>
+        <w:rPr>
+          <w:sz w:val="28"/>
+          <w:szCs w:val="28"/>
+          <w:highlight w:val="yellow"/>
+          <w:lang w:val="fr-FR"/>
+        </w:rPr>
+        <w:t xml:space="preserve"> </w:t>
+      </w:r>
+      <w:r>
+        <w:rPr>
+          <w:sz w:val="28"/>
+          <w:szCs w:val="28"/>
+          <w:highlight w:val="yellow"/>
+          <w:lang w:val="fr-FR"/>
+        </w:rPr>
+        <w:t>réglementaires</w:t>
+      </w:r>
+      <w:r>
+        <w:rPr>
+          <w:sz w:val="28"/>
+          <w:szCs w:val="28"/>
+          <w:highlight w:val="yellow"/>
+          <w:lang w:val="fr-FR"/>
+        </w:rPr>
+        <w:t xml:space="preserve"> </w:t>
+      </w:r>
+      <w:r>
+        <w:rPr>
+          <w:sz w:val="28"/>
+          <w:szCs w:val="28"/>
+          <w:highlight w:val="yellow"/>
+          <w:lang w:val="fr-FR"/>
+        </w:rPr>
+        <w:t>en matière de sécurité informatique en lien avec l’utilisation de signature numérique par exemple.</w:t>
+      </w:r>
+    </w:p>
+    <w:p>
+      <w:pPr>
+        <w:spacing w:line="360" w:lineRule="auto"/>
+        <w:jc w:val="both"/>
+        <w:rPr>
+          <w:sz w:val="28"/>
+          <w:szCs w:val="28"/>
+          <w:lang w:val="fr-FR"/>
+        </w:rPr>
+      </w:pPr>
+    </w:p>
+    <w:p>
+      <w:pPr>
+        <w:spacing w:line="360" w:lineRule="auto"/>
+        <w:jc w:val="both"/>
+        <w:rPr>
+          <w:b/>
+          <w:bCs/>
+          <w:sz w:val="28"/>
+          <w:szCs w:val="28"/>
+          <w:lang w:val="fr-FR"/>
+        </w:rPr>
+      </w:pPr>
+      <w:r>
+        <w:rPr>
+          <w:b/>
+          <w:bCs/>
+          <w:sz w:val="28"/>
+          <w:szCs w:val="28"/>
+          <w:lang w:val="fr-FR"/>
+        </w:rPr>
+        <w:t>Traduction</w:t>
+      </w:r>
+      <w:r>
+        <w:rPr>
+          <w:b/>
+          <w:bCs/>
+          <w:sz w:val="28"/>
+          <w:szCs w:val="28"/>
+          <w:lang w:val="fr-FR"/>
+        </w:rPr>
+        <w:t xml:space="preserve"> de la section en </w:t>
+      </w:r>
+      <w:proofErr w:type="gramStart"/>
+      <w:r>
+        <w:rPr>
+          <w:b/>
+          <w:bCs/>
+          <w:sz w:val="28"/>
+          <w:szCs w:val="28"/>
+          <w:lang w:val="fr-FR"/>
+        </w:rPr>
+        <w:t>jaune</w:t>
+      </w:r>
+      <w:r>
+        <w:rPr>
+          <w:b/>
+          <w:bCs/>
+          <w:sz w:val="28"/>
+          <w:szCs w:val="28"/>
+          <w:lang w:val="fr-FR"/>
+        </w:rPr>
+        <w:t>:</w:t>
+      </w:r>
+      <w:proofErr w:type="gramEnd"/>
+      <w:r>
+        <w:rPr>
+          <w:b/>
+          <w:bCs/>
+          <w:sz w:val="28"/>
+          <w:szCs w:val="28"/>
+          <w:lang w:val="fr-FR"/>
+        </w:rPr>
+        <w:t xml:space="preserve"> </w:t>
+      </w:r>
+    </w:p>
+    <w:p>
+      <w:pPr>
+        <w:spacing w:line="360" w:lineRule="auto"/>
+        <w:jc w:val="both"/>
+        <w:rPr>
+          <w:sz w:val="28"/>
+          <w:szCs w:val="28"/>
+          <w:lang w:val="en-US"/>
+        </w:rPr>
+      </w:pPr>
+      <w:r>
+        <w:rPr>
+          <w:sz w:val="28"/>
+          <w:szCs w:val="28"/>
+          <w:lang w:val="en-US"/>
+        </w:rPr>
+        <w:t>The solution we propose has major implications.</w:t>
+      </w:r>
+    </w:p>
+    <w:p>
+      <w:pPr>
+        <w:spacing w:line="360" w:lineRule="auto"/>
+        <w:jc w:val="both"/>
+        <w:rPr>
+          <w:sz w:val="28"/>
+          <w:szCs w:val="28"/>
+          <w:lang w:val="en-US"/>
+        </w:rPr>
+      </w:pPr>
+      <w:r>
+        <w:rPr>
+          <w:sz w:val="28"/>
+          <w:szCs w:val="28"/>
+          <w:lang w:val="en-US"/>
+        </w:rPr>
+        <w:t xml:space="preserve">In terms of scalability, several simultaneous verification operations can be performed on the Ethereum network without any major impact on end users. However, simultaneous large-scale administrative document registration operations (hundreds or </w:t>
+      </w:r>
+      <w:r>
+        <w:rPr>
+          <w:sz w:val="28"/>
+          <w:szCs w:val="28"/>
+          <w:lang w:val="en-US"/>
+        </w:rPr>
+        <w:lastRenderedPageBreak/>
+        <w:t xml:space="preserve">even thousands) on the Ethereum </w:t>
+      </w:r>
+      <w:proofErr w:type="spellStart"/>
+      <w:r>
+        <w:rPr>
+          <w:sz w:val="28"/>
+          <w:szCs w:val="28"/>
+          <w:lang w:val="en-US"/>
+        </w:rPr>
+        <w:t>Mainnet</w:t>
+      </w:r>
+      <w:proofErr w:type="spellEnd"/>
+      <w:r>
+        <w:rPr>
+          <w:sz w:val="28"/>
+          <w:szCs w:val="28"/>
+          <w:lang w:val="en-US"/>
+        </w:rPr>
+        <w:t xml:space="preserve"> could result in a response time longer than 4247.66 milliseconds. In addition to a high number of transactions, there could also be a high volume of blockchain transaction data. The greater the volume of transaction data, the more ETH is needed to incentivize rapid validation of these Ethereum transactions. Our approach remains advantageous for administrations and citizens. This is because in the manual document authentication system, which involves several human actors, a single authentication operation takes days and incurs financial costs that are necessarily higher than $10 (given that the average 0.0005168205083614 ETH = $1.08 according to https://www.xe.com/ fr/currencyconverter/convert/?Amount=0.0005168205083614&amp;From=ETH&amp;To=USD on 02/25/2026).</w:t>
+      </w:r>
+    </w:p>
+    <w:p>
+      <w:pPr>
+        <w:spacing w:line="360" w:lineRule="auto"/>
+        <w:jc w:val="both"/>
+        <w:rPr>
+          <w:sz w:val="28"/>
+          <w:szCs w:val="28"/>
+          <w:lang w:val="en-US"/>
+        </w:rPr>
+      </w:pPr>
+      <w:r>
+        <w:rPr>
+          <w:sz w:val="28"/>
+          <w:szCs w:val="28"/>
+          <w:lang w:val="en-US"/>
+        </w:rPr>
+        <w:t xml:space="preserve">In terms of usability, the approach requires few </w:t>
+      </w:r>
+      <w:r>
+        <w:rPr>
+          <w:sz w:val="28"/>
+          <w:szCs w:val="28"/>
+          <w:lang w:val="en-US"/>
+        </w:rPr>
+        <w:t>information technology (</w:t>
+      </w:r>
+      <w:r>
+        <w:rPr>
+          <w:sz w:val="28"/>
+          <w:szCs w:val="28"/>
+          <w:lang w:val="en-US"/>
+        </w:rPr>
+        <w:t>IT</w:t>
+      </w:r>
+      <w:r>
+        <w:rPr>
+          <w:sz w:val="28"/>
+          <w:szCs w:val="28"/>
+          <w:lang w:val="en-US"/>
+        </w:rPr>
+        <w:t>)</w:t>
+      </w:r>
+      <w:r>
+        <w:rPr>
+          <w:sz w:val="28"/>
+          <w:szCs w:val="28"/>
+          <w:lang w:val="en-US"/>
+        </w:rPr>
+        <w:t xml:space="preserve"> resources. Administrations are increasingly moving towards modernizing their services and are equipped with IT hardware that is capable of supporting our solution. Today's citizens already use smartphones and will be able to easily verify the authenticity of electronic documents using these devices.</w:t>
+      </w:r>
+    </w:p>
+    <w:p>
+      <w:pPr>
+        <w:spacing w:line="360" w:lineRule="auto"/>
+        <w:jc w:val="both"/>
+        <w:rPr>
+          <w:sz w:val="28"/>
+          <w:szCs w:val="28"/>
+          <w:lang w:val="en-US"/>
+        </w:rPr>
+      </w:pPr>
+      <w:r>
+        <w:rPr>
+          <w:sz w:val="28"/>
+          <w:szCs w:val="28"/>
+          <w:lang w:val="en-US"/>
+        </w:rPr>
+        <w:t>Nevertheless, there are still some obstacles that are considered challenges</w:t>
+      </w:r>
+      <w:r>
+        <w:rPr>
+          <w:sz w:val="28"/>
+          <w:szCs w:val="28"/>
+          <w:lang w:val="en-US"/>
+        </w:rPr>
+        <w:t>, namely</w:t>
+      </w:r>
+      <w:r>
+        <w:rPr>
+          <w:sz w:val="28"/>
+          <w:szCs w:val="28"/>
+          <w:lang w:val="en-US"/>
+        </w:rPr>
+        <w:t>:</w:t>
+      </w:r>
+    </w:p>
+    <w:p>
+      <w:pPr>
+        <w:pStyle w:val="Paragraphedeliste"/>
+        <w:numPr>
+          <w:ilvl w:val="0"/>
+          <w:numId w:val="9"/>
+        </w:numPr>
+        <w:spacing w:line="360" w:lineRule="auto"/>
+        <w:jc w:val="both"/>
+        <w:rPr>
+          <w:sz w:val="28"/>
+          <w:szCs w:val="28"/>
+          <w:lang w:val="en-US"/>
+        </w:rPr>
+      </w:pPr>
+      <w:r>
+        <w:rPr>
+          <w:sz w:val="28"/>
+          <w:szCs w:val="28"/>
+          <w:lang w:val="en-US"/>
+        </w:rPr>
+        <w:t>i</w:t>
+      </w:r>
+      <w:r>
+        <w:rPr>
+          <w:sz w:val="28"/>
+          <w:szCs w:val="28"/>
+          <w:lang w:val="en-US"/>
+        </w:rPr>
+        <w:t>nteroperability, as communication must be possible between the Ethereum blockchain network and existing infrastructure in government agencies [18].</w:t>
+      </w:r>
+    </w:p>
+    <w:p>
+      <w:pPr>
+        <w:pStyle w:val="Paragraphedeliste"/>
+        <w:numPr>
+          <w:ilvl w:val="0"/>
+          <w:numId w:val="9"/>
+        </w:numPr>
+        <w:spacing w:line="360" w:lineRule="auto"/>
+        <w:jc w:val="both"/>
+        <w:rPr>
+          <w:sz w:val="28"/>
+          <w:szCs w:val="28"/>
+          <w:lang w:val="en-US"/>
+        </w:rPr>
+      </w:pPr>
+      <w:r>
+        <w:rPr>
+          <w:sz w:val="28"/>
+          <w:szCs w:val="28"/>
+          <w:lang w:val="en-US"/>
+        </w:rPr>
+        <w:t>r</w:t>
+      </w:r>
+      <w:r>
+        <w:rPr>
+          <w:sz w:val="28"/>
+          <w:szCs w:val="28"/>
+          <w:lang w:val="en-US"/>
+        </w:rPr>
+        <w:t>evision of regulations governing public spending to take into account cryptocurrencies or their parity. This will facilitate the payment of blockchain transaction fees.</w:t>
+      </w:r>
+    </w:p>
+    <w:p>
+      <w:pPr>
+        <w:pStyle w:val="Paragraphedeliste"/>
+        <w:numPr>
+          <w:ilvl w:val="0"/>
+          <w:numId w:val="9"/>
+        </w:numPr>
+        <w:spacing w:line="360" w:lineRule="auto"/>
+        <w:jc w:val="both"/>
+        <w:rPr>
+          <w:sz w:val="28"/>
+          <w:szCs w:val="28"/>
+          <w:lang w:val="en-US"/>
+        </w:rPr>
+      </w:pPr>
+      <w:r>
+        <w:rPr>
+          <w:sz w:val="28"/>
+          <w:szCs w:val="28"/>
+          <w:lang w:val="en-US"/>
+        </w:rPr>
+        <w:t>the adoption of regulatory texts on IT security in relation to the use of digital signatures, for example.</w:t>
+      </w:r>
+    </w:p>
+    <w:p>
+      <w:pPr>
+        <w:spacing w:line="360" w:lineRule="auto"/>
+        <w:jc w:val="both"/>
+        <w:rPr>
+          <w:sz w:val="28"/>
+          <w:szCs w:val="28"/>
+          <w:lang w:val="en-US"/>
+        </w:rPr>
+      </w:pPr>
+    </w:p>
+    <w:p>
+      <w:pPr>
+        <w:spacing w:line="360" w:lineRule="auto"/>
+        <w:jc w:val="both"/>
+        <w:rPr>
+          <w:sz w:val="28"/>
+          <w:szCs w:val="28"/>
+          <w:lang w:val="en-US"/>
+        </w:rPr>
+      </w:pPr>
+      <w:r>
+        <w:rPr>
+          <w:rFonts w:ascii="AppleSystemUIFont" w:eastAsiaTheme="minorHAnsi" w:hAnsi="AppleSystemUIFont" w:cs="AppleSystemUIFont"/>
+          <w:sz w:val="38"/>
+          <w:szCs w:val="38"/>
+          <w:lang w:val="en-US" w:eastAsia="en-US"/>
+          <w14:ligatures w14:val="standardContextual"/>
+        </w:rPr>
+        <w:lastRenderedPageBreak/>
+        <w:t xml:space="preserve">[18] </w:t>
+      </w:r>
+      <w:r>
+        <w:rPr>
+          <w:rFonts w:ascii="AppleSystemUIFont" w:eastAsiaTheme="minorHAnsi" w:hAnsi="AppleSystemUIFont" w:cs="AppleSystemUIFont"/>
+          <w:sz w:val="34"/>
+          <w:szCs w:val="34"/>
+          <w:lang w:val="en-US" w:eastAsia="en-US"/>
+          <w14:ligatures w14:val="standardContextual"/>
+        </w:rPr>
+        <w:t xml:space="preserve">S. Das, T. K. Samal, B. K. Mohanta, et N. N. Ahamed: Blockchain-Driven Solutions for Healthcare Insurance Fraud Detection and Prevention. </w:t>
+      </w:r>
+      <w:proofErr w:type="spellStart"/>
+      <w:r>
+        <w:rPr>
+          <w:rFonts w:ascii="AppleSystemUIFont" w:eastAsiaTheme="minorHAnsi" w:hAnsi="AppleSystemUIFont" w:cs="AppleSystemUIFont"/>
+          <w:i/>
+          <w:iCs/>
+          <w:sz w:val="34"/>
+          <w:szCs w:val="34"/>
+          <w:lang w:val="fr-FR" w:eastAsia="en-US"/>
+          <w14:ligatures w14:val="standardContextual"/>
+        </w:rPr>
+        <w:t>Secur</w:t>
+      </w:r>
+      <w:proofErr w:type="spellEnd"/>
+      <w:r>
+        <w:rPr>
+          <w:rFonts w:ascii="AppleSystemUIFont" w:eastAsiaTheme="minorHAnsi" w:hAnsi="AppleSystemUIFont" w:cs="AppleSystemUIFont"/>
+          <w:i/>
+          <w:iCs/>
+          <w:sz w:val="34"/>
+          <w:szCs w:val="34"/>
+          <w:lang w:val="fr-FR" w:eastAsia="en-US"/>
+          <w14:ligatures w14:val="standardContextual"/>
+        </w:rPr>
+        <w:t>. Pr</w:t>
+      </w:r>
+      <w:proofErr w:type="spellStart"/>
+      <w:r>
+        <w:rPr>
+          <w:rFonts w:ascii="AppleSystemUIFont" w:eastAsiaTheme="minorHAnsi" w:hAnsi="AppleSystemUIFont" w:cs="AppleSystemUIFont"/>
+          <w:i/>
+          <w:iCs/>
+          <w:sz w:val="34"/>
+          <w:szCs w:val="34"/>
+          <w:lang w:val="fr-FR" w:eastAsia="en-US"/>
+          <w14:ligatures w14:val="standardContextual"/>
+        </w:rPr>
+        <w:t>iv</w:t>
+      </w:r>
+      <w:proofErr w:type="spellEnd"/>
+      <w:r>
+        <w:rPr>
+          <w:rFonts w:ascii="AppleSystemUIFont" w:eastAsiaTheme="minorHAnsi" w:hAnsi="AppleSystemUIFont" w:cs="AppleSystemUIFont"/>
+          <w:i/>
+          <w:iCs/>
+          <w:sz w:val="34"/>
+          <w:szCs w:val="34"/>
+          <w:lang w:val="fr-FR" w:eastAsia="en-US"/>
+          <w14:ligatures w14:val="standardContextual"/>
+        </w:rPr>
+        <w:t>.</w:t>
+      </w:r>
+      <w:r>
+        <w:rPr>
+          <w:rFonts w:ascii="AppleSystemUIFont" w:eastAsiaTheme="minorHAnsi" w:hAnsi="AppleSystemUIFont" w:cs="AppleSystemUIFont"/>
+          <w:sz w:val="34"/>
+          <w:szCs w:val="34"/>
+          <w:lang w:val="fr-FR" w:eastAsia="en-US"/>
+          <w14:ligatures w14:val="standardContextual"/>
+        </w:rPr>
+        <w:t>, vol. 9, n</w:t>
+      </w:r>
+      <w:r>
+        <w:rPr>
+          <w:rFonts w:ascii="AppleSystemUIFont" w:eastAsiaTheme="minorHAnsi" w:hAnsi="AppleSystemUIFont" w:cs="AppleSystemUIFont"/>
+          <w:sz w:val="29"/>
+          <w:szCs w:val="29"/>
+          <w:vertAlign w:val="superscript"/>
+          <w:lang w:val="fr-FR" w:eastAsia="en-US"/>
+          <w14:ligatures w14:val="standardContextual"/>
+        </w:rPr>
+        <w:t>o</w:t>
+      </w:r>
+      <w:r>
+        <w:rPr>
+          <w:rFonts w:ascii="AppleSystemUIFont" w:eastAsiaTheme="minorHAnsi" w:hAnsi="AppleSystemUIFont" w:cs="AppleSystemUIFont"/>
+          <w:sz w:val="34"/>
+          <w:szCs w:val="34"/>
+          <w:lang w:val="fr-FR" w:eastAsia="en-US"/>
+          <w14:ligatures w14:val="standardContextual"/>
+        </w:rPr>
+        <w:t xml:space="preserve"> 1, p. e70149, (2025), </w:t>
+      </w:r>
+      <w:proofErr w:type="spellStart"/>
+      <w:proofErr w:type="gramStart"/>
+      <w:r>
+        <w:rPr>
+          <w:rFonts w:ascii="AppleSystemUIFont" w:eastAsiaTheme="minorHAnsi" w:hAnsi="AppleSystemUIFont" w:cs="AppleSystemUIFont"/>
+          <w:sz w:val="34"/>
+          <w:szCs w:val="34"/>
+          <w:lang w:val="fr-FR" w:eastAsia="en-US"/>
+          <w14:ligatures w14:val="standardContextual"/>
+        </w:rPr>
+        <w:t>doi</w:t>
+      </w:r>
+      <w:proofErr w:type="spellEnd"/>
+      <w:r>
+        <w:rPr>
+          <w:rFonts w:ascii="AppleSystemUIFont" w:eastAsiaTheme="minorHAnsi" w:hAnsi="AppleSystemUIFont" w:cs="AppleSystemUIFont"/>
+          <w:sz w:val="34"/>
+          <w:szCs w:val="34"/>
+          <w:lang w:val="fr-FR" w:eastAsia="en-US"/>
+          <w14:ligatures w14:val="standardContextual"/>
+        </w:rPr>
+        <w:t>:</w:t>
+      </w:r>
+      <w:proofErr w:type="gramEnd"/>
+      <w:r>
+        <w:rPr>
+          <w:rFonts w:ascii="AppleSystemUIFont" w:eastAsiaTheme="minorHAnsi" w:hAnsi="AppleSystemUIFont" w:cs="AppleSystemUIFont"/>
+          <w:sz w:val="34"/>
+          <w:szCs w:val="34"/>
+          <w:lang w:val="fr-FR" w:eastAsia="en-US"/>
+          <w14:ligatures w14:val="standardContextual"/>
+        </w:rPr>
+        <w:t xml:space="preserve"> 10.1002/spy2.70149.</w:t>
+      </w:r>
+    </w:p>
     <w:sectPr>
       <w:pgSz w:w="16838" w:h="11906" w:orient="landscape"/>
       <w:pgMar w:top="1440" w:right="1440" w:bottom="1440" w:left="1440" w:header="708" w:footer="708" w:gutter="0"/>
@@ -3994,6 +4859,119 @@
     </w:lvl>
   </w:abstractNum>
   <w:abstractNum w:abstractNumId="2" w15:restartNumberingAfterBreak="0">
+    <w:nsid w:val="179B3A54"/>
+    <w:multiLevelType w:val="hybridMultilevel"/>
+    <w:tmpl w:val="CC300586"/>
+    <w:lvl w:ilvl="0" w:tplc="040C0001">
+      <w:start w:val="1"/>
+      <w:numFmt w:val="bullet"/>
+      <w:lvlText w:val=""/>
+      <w:lvlJc w:val="left"/>
+      <w:pPr>
+        <w:ind w:left="720" w:hanging="360"/>
+      </w:pPr>
+      <w:rPr>
+        <w:rFonts w:ascii="Symbol" w:hAnsi="Symbol" w:hint="default"/>
+      </w:rPr>
+    </w:lvl>
+    <w:lvl w:ilvl="1" w:tplc="040C0003" w:tentative="1">
+      <w:start w:val="1"/>
+      <w:numFmt w:val="bullet"/>
+      <w:lvlText w:val="o"/>
+      <w:lvlJc w:val="left"/>
+      <w:pPr>
+        <w:ind w:left="1440" w:hanging="360"/>
+      </w:pPr>
+      <w:rPr>
+        <w:rFonts w:ascii="Courier New" w:hAnsi="Courier New" w:hint="default"/>
+      </w:rPr>
+    </w:lvl>
+    <w:lvl w:ilvl="2" w:tplc="040C0005" w:tentative="1">
+      <w:start w:val="1"/>
+      <w:numFmt w:val="bullet"/>
+      <w:lvlText w:val=""/>
+      <w:lvlJc w:val="left"/>
+      <w:pPr>
+        <w:ind w:left="2160" w:hanging="360"/>
+      </w:pPr>
+      <w:rPr>
+        <w:rFonts w:ascii="Wingdings" w:hAnsi="Wingdings" w:hint="default"/>
+      </w:rPr>
+    </w:lvl>
+    <w:lvl w:ilvl="3" w:tplc="040C0001" w:tentative="1">
+      <w:start w:val="1"/>
+      <w:numFmt w:val="bullet"/>
+      <w:lvlText w:val=""/>
+      <w:lvlJc w:val="left"/>
+      <w:pPr>
+        <w:ind w:left="2880" w:hanging="360"/>
+      </w:pPr>
+      <w:rPr>
+        <w:rFonts w:ascii="Symbol" w:hAnsi="Symbol" w:hint="default"/>
+      </w:rPr>
+    </w:lvl>
+    <w:lvl w:ilvl="4" w:tplc="040C0003" w:tentative="1">
+      <w:start w:val="1"/>
+      <w:numFmt w:val="bullet"/>
+      <w:lvlText w:val="o"/>
+      <w:lvlJc w:val="left"/>
+      <w:pPr>
+        <w:ind w:left="3600" w:hanging="360"/>
+      </w:pPr>
+      <w:rPr>
+        <w:rFonts w:ascii="Courier New" w:hAnsi="Courier New" w:hint="default"/>
+      </w:rPr>
+    </w:lvl>
+    <w:lvl w:ilvl="5" w:tplc="040C0005" w:tentative="1">
+      <w:start w:val="1"/>
+      <w:numFmt w:val="bullet"/>
+      <w:lvlText w:val=""/>
+      <w:lvlJc w:val="left"/>
+      <w:pPr>
+        <w:ind w:left="4320" w:hanging="360"/>
+      </w:pPr>
+      <w:rPr>
+        <w:rFonts w:ascii="Wingdings" w:hAnsi="Wingdings" w:hint="default"/>
+      </w:rPr>
+    </w:lvl>
+    <w:lvl w:ilvl="6" w:tplc="040C0001" w:tentative="1">
+      <w:start w:val="1"/>
+      <w:numFmt w:val="bullet"/>
+      <w:lvlText w:val=""/>
+      <w:lvlJc w:val="left"/>
+      <w:pPr>
+        <w:ind w:left="5040" w:hanging="360"/>
+      </w:pPr>
+      <w:rPr>
+        <w:rFonts w:ascii="Symbol" w:hAnsi="Symbol" w:hint="default"/>
+      </w:rPr>
+    </w:lvl>
+    <w:lvl w:ilvl="7" w:tplc="040C0003" w:tentative="1">
+      <w:start w:val="1"/>
+      <w:numFmt w:val="bullet"/>
+      <w:lvlText w:val="o"/>
+      <w:lvlJc w:val="left"/>
+      <w:pPr>
+        <w:ind w:left="5760" w:hanging="360"/>
+      </w:pPr>
+      <w:rPr>
+        <w:rFonts w:ascii="Courier New" w:hAnsi="Courier New" w:hint="default"/>
+      </w:rPr>
+    </w:lvl>
+    <w:lvl w:ilvl="8" w:tplc="040C0005" w:tentative="1">
+      <w:start w:val="1"/>
+      <w:numFmt w:val="bullet"/>
+      <w:lvlText w:val=""/>
+      <w:lvlJc w:val="left"/>
+      <w:pPr>
+        <w:ind w:left="6480" w:hanging="360"/>
+      </w:pPr>
+      <w:rPr>
+        <w:rFonts w:ascii="Wingdings" w:hAnsi="Wingdings" w:hint="default"/>
+      </w:rPr>
+    </w:lvl>
+  </w:abstractNum>
+  <w:abstractNum w:abstractNumId="3" w15:restartNumberingAfterBreak="0">
     <w:nsid w:val="1A7B0CC5"/>
     <w:multiLevelType w:val="hybridMultilevel"/>
     <w:tmpl w:val="2AD24750"/>
@@ -4105,7 +5083,120 @@
       </w:rPr>
     </w:lvl>
   </w:abstractNum>
-  <w:abstractNum w:abstractNumId="3" w15:restartNumberingAfterBreak="0">
+  <w:abstractNum w:abstractNumId="4" w15:restartNumberingAfterBreak="0">
+    <w:nsid w:val="41B0512D"/>
+    <w:multiLevelType w:val="hybridMultilevel"/>
+    <w:tmpl w:val="E48440C2"/>
+    <w:lvl w:ilvl="0" w:tplc="040C0001">
+      <w:start w:val="1"/>
+      <w:numFmt w:val="bullet"/>
+      <w:lvlText w:val=""/>
+      <w:lvlJc w:val="left"/>
+      <w:pPr>
+        <w:ind w:left="720" w:hanging="360"/>
+      </w:pPr>
+      <w:rPr>
+        <w:rFonts w:ascii="Symbol" w:hAnsi="Symbol" w:hint="default"/>
+      </w:rPr>
+    </w:lvl>
+    <w:lvl w:ilvl="1" w:tplc="040C0003" w:tentative="1">
+      <w:start w:val="1"/>
+      <w:numFmt w:val="bullet"/>
+      <w:lvlText w:val="o"/>
+      <w:lvlJc w:val="left"/>
+      <w:pPr>
+        <w:ind w:left="1440" w:hanging="360"/>
+      </w:pPr>
+      <w:rPr>
+        <w:rFonts w:ascii="Courier New" w:hAnsi="Courier New" w:hint="default"/>
+      </w:rPr>
+    </w:lvl>
+    <w:lvl w:ilvl="2" w:tplc="040C0005" w:tentative="1">
+      <w:start w:val="1"/>
+      <w:numFmt w:val="bullet"/>
+      <w:lvlText w:val=""/>
+      <w:lvlJc w:val="left"/>
+      <w:pPr>
+        <w:ind w:left="2160" w:hanging="360"/>
+      </w:pPr>
+      <w:rPr>
+        <w:rFonts w:ascii="Wingdings" w:hAnsi="Wingdings" w:hint="default"/>
+      </w:rPr>
+    </w:lvl>
+    <w:lvl w:ilvl="3" w:tplc="040C0001" w:tentative="1">
+      <w:start w:val="1"/>
+      <w:numFmt w:val="bullet"/>
+      <w:lvlText w:val=""/>
+      <w:lvlJc w:val="left"/>
+      <w:pPr>
+        <w:ind w:left="2880" w:hanging="360"/>
+      </w:pPr>
+      <w:rPr>
+        <w:rFonts w:ascii="Symbol" w:hAnsi="Symbol" w:hint="default"/>
+      </w:rPr>
+    </w:lvl>
+    <w:lvl w:ilvl="4" w:tplc="040C0003" w:tentative="1">
+      <w:start w:val="1"/>
+      <w:numFmt w:val="bullet"/>
+      <w:lvlText w:val="o"/>
+      <w:lvlJc w:val="left"/>
+      <w:pPr>
+        <w:ind w:left="3600" w:hanging="360"/>
+      </w:pPr>
+      <w:rPr>
+        <w:rFonts w:ascii="Courier New" w:hAnsi="Courier New" w:hint="default"/>
+      </w:rPr>
+    </w:lvl>
+    <w:lvl w:ilvl="5" w:tplc="040C0005" w:tentative="1">
+      <w:start w:val="1"/>
+      <w:numFmt w:val="bullet"/>
+      <w:lvlText w:val=""/>
+      <w:lvlJc w:val="left"/>
+      <w:pPr>
+        <w:ind w:left="4320" w:hanging="360"/>
+      </w:pPr>
+      <w:rPr>
+        <w:rFonts w:ascii="Wingdings" w:hAnsi="Wingdings" w:hint="default"/>
+      </w:rPr>
+    </w:lvl>
+    <w:lvl w:ilvl="6" w:tplc="040C0001" w:tentative="1">
+      <w:start w:val="1"/>
+      <w:numFmt w:val="bullet"/>
+      <w:lvlText w:val=""/>
+      <w:lvlJc w:val="left"/>
+      <w:pPr>
+        <w:ind w:left="5040" w:hanging="360"/>
+      </w:pPr>
+      <w:rPr>
+        <w:rFonts w:ascii="Symbol" w:hAnsi="Symbol" w:hint="default"/>
+      </w:rPr>
+    </w:lvl>
+    <w:lvl w:ilvl="7" w:tplc="040C0003" w:tentative="1">
+      <w:start w:val="1"/>
+      <w:numFmt w:val="bullet"/>
+      <w:lvlText w:val="o"/>
+      <w:lvlJc w:val="left"/>
+      <w:pPr>
+        <w:ind w:left="5760" w:hanging="360"/>
+      </w:pPr>
+      <w:rPr>
+        <w:rFonts w:ascii="Courier New" w:hAnsi="Courier New" w:hint="default"/>
+      </w:rPr>
+    </w:lvl>
+    <w:lvl w:ilvl="8" w:tplc="040C0005" w:tentative="1">
+      <w:start w:val="1"/>
+      <w:numFmt w:val="bullet"/>
+      <w:lvlText w:val=""/>
+      <w:lvlJc w:val="left"/>
+      <w:pPr>
+        <w:ind w:left="6480" w:hanging="360"/>
+      </w:pPr>
+      <w:rPr>
+        <w:rFonts w:ascii="Wingdings" w:hAnsi="Wingdings" w:hint="default"/>
+      </w:rPr>
+    </w:lvl>
+  </w:abstractNum>
+  <w:abstractNum w:abstractNumId="5" w15:restartNumberingAfterBreak="0">
     <w:nsid w:val="4B0B3428"/>
     <w:multiLevelType w:val="hybridMultilevel"/>
     <w:tmpl w:val="2F649E72"/>
@@ -4218,7 +5309,7 @@
       </w:rPr>
     </w:lvl>
   </w:abstractNum>
-  <w:abstractNum w:abstractNumId="4" w15:restartNumberingAfterBreak="0">
+  <w:abstractNum w:abstractNumId="6" w15:restartNumberingAfterBreak="0">
     <w:nsid w:val="59654937"/>
     <w:multiLevelType w:val="hybridMultilevel"/>
     <w:tmpl w:val="F042CB42"/>
@@ -4331,7 +5422,7 @@
       </w:rPr>
     </w:lvl>
   </w:abstractNum>
-  <w:abstractNum w:abstractNumId="5" w15:restartNumberingAfterBreak="0">
+  <w:abstractNum w:abstractNumId="7" w15:restartNumberingAfterBreak="0">
     <w:nsid w:val="78552995"/>
     <w:multiLevelType w:val="hybridMultilevel"/>
     <w:tmpl w:val="E81C03CE"/>
@@ -4444,7 +5535,7 @@
       </w:rPr>
     </w:lvl>
   </w:abstractNum>
-  <w:abstractNum w:abstractNumId="6" w15:restartNumberingAfterBreak="0">
+  <w:abstractNum w:abstractNumId="8" w15:restartNumberingAfterBreak="0">
     <w:nsid w:val="7D2A08D3"/>
     <w:multiLevelType w:val="hybridMultilevel"/>
     <w:tmpl w:val="5FE68C5C"/>
@@ -4558,25 +5649,31 @@
     </w:lvl>
   </w:abstractNum>
   <w:num w:numId="1" w16cid:durableId="1103647915">
-    <w:abstractNumId w:val="4"/>
+    <w:abstractNumId w:val="6"/>
   </w:num>
   <w:num w:numId="2" w16cid:durableId="1600749428">
-    <w:abstractNumId w:val="2"/>
+    <w:abstractNumId w:val="3"/>
   </w:num>
   <w:num w:numId="3" w16cid:durableId="567690237">
     <w:abstractNumId w:val="0"/>
   </w:num>
   <w:num w:numId="4" w16cid:durableId="1973246604">
-    <w:abstractNumId w:val="5"/>
+    <w:abstractNumId w:val="7"/>
   </w:num>
   <w:num w:numId="5" w16cid:durableId="1111122226">
     <w:abstractNumId w:val="1"/>
   </w:num>
   <w:num w:numId="6" w16cid:durableId="1603151785">
-    <w:abstractNumId w:val="3"/>
+    <w:abstractNumId w:val="5"/>
   </w:num>
   <w:num w:numId="7" w16cid:durableId="831062500">
-    <w:abstractNumId w:val="6"/>
+    <w:abstractNumId w:val="8"/>
+  </w:num>
+  <w:num w:numId="8" w16cid:durableId="1274023477">
+    <w:abstractNumId w:val="4"/>
+  </w:num>
+  <w:num w:numId="9" w16cid:durableId="1701469837">
+    <w:abstractNumId w:val="2"/>
   </w:num>
 </w:numbering>
 </file>

</xml_diff>